<commit_message>
Update Stage A submission document
</commit_message>
<xml_diff>
--- a/docs/Stage A submission/StageA_Submission_Landscape.docx
+++ b/docs/Stage A submission/StageA_Submission_Landscape.docx
@@ -8,9 +8,11 @@
         <w:pageBreakBefore/>
         <w:jc w:val="center"/>
       </w:pPr>
+      <w:proofErr w:type="spellStart"/>
       <w:r>
         <w:t>GhostHouses</w:t>
       </w:r>
+      <w:proofErr w:type="spellEnd"/>
       <w:r>
         <w:t xml:space="preserve"> - </w:t>
       </w:r>
@@ -45,12 +47,25 @@
     </w:p>
     <w:p>
       <w:r>
-        <w:t>Additional scope since HLD: multi‑select building card export (Issue #74) and expanded import/export workflows + template converter.</w:t>
+        <w:t>Additional scope since HLD</w:t>
+      </w:r>
+      <w:proofErr w:type="gramStart"/>
+      <w:r>
+        <w:t>: multi‑select</w:t>
+      </w:r>
+      <w:proofErr w:type="gramEnd"/>
+      <w:r>
+        <w:t xml:space="preserve"> building card export (Issue #74) and expanded import/export workflows + template converter.</w:t>
       </w:r>
     </w:p>
     <w:p>
+      <w:proofErr w:type="gramStart"/>
       <w:r>
-        <w:t>Current status: core workflows are Done. Backlog items for Stage B are US‑2 2FA integration, US‑3 admin permission management, US‑7 building‑card template update, and US‑16 external system sync.</w:t>
+        <w:t>Current status</w:t>
+      </w:r>
+      <w:proofErr w:type="gramEnd"/>
+      <w:r>
+        <w:t>: core workflows are Done. Backlog items for Stage B are US‑2 2FA integration, US‑3 admin permission management, US‑7 building‑card template update, and US‑16 external system sync.</w:t>
       </w:r>
     </w:p>
     <w:tbl>
@@ -60,10 +75,10 @@
         <w:tblLook w:val="04A0" w:firstRow="1" w:lastRow="0" w:firstColumn="1" w:lastColumn="0" w:noHBand="0" w:noVBand="1"/>
       </w:tblPr>
       <w:tblGrid>
-        <w:gridCol w:w="1772"/>
+        <w:gridCol w:w="2160"/>
         <w:gridCol w:w="2488"/>
-        <w:gridCol w:w="1996"/>
-        <w:gridCol w:w="2040"/>
+        <w:gridCol w:w="2160"/>
+        <w:gridCol w:w="2160"/>
       </w:tblGrid>
       <w:tr>
         <w:tc>
@@ -375,8 +390,13 @@
             <w:tcW w:w="2160" w:type="dxa"/>
           </w:tcPr>
           <w:p>
+            <w:proofErr w:type="gramStart"/>
             <w:r>
-              <w:t>Export building card for presentations</w:t>
+              <w:t>Export</w:t>
+            </w:r>
+            <w:proofErr w:type="gramEnd"/>
+            <w:r>
+              <w:t xml:space="preserve"> building card for presentations</w:t>
             </w:r>
           </w:p>
         </w:tc>
@@ -396,7 +416,15 @@
           </w:tcPr>
           <w:p>
             <w:r>
-              <w:t>Issue #26 open only for template updates (#82).</w:t>
+              <w:t xml:space="preserve">Issue #26 open only for template </w:t>
+            </w:r>
+            <w:proofErr w:type="gramStart"/>
+            <w:r>
+              <w:t>updates (#</w:t>
+            </w:r>
+            <w:proofErr w:type="gramEnd"/>
+            <w:r>
+              <w:t>82).</w:t>
             </w:r>
           </w:p>
         </w:tc>
@@ -408,6 +436,7 @@
           </w:tcPr>
           <w:p>
             <w:r>
+              <w:lastRenderedPageBreak/>
               <w:t>US-8</w:t>
             </w:r>
           </w:p>
@@ -648,7 +677,15 @@
           </w:tcPr>
           <w:p>
             <w:r>
-              <w:t>Issue #32 closed (logs auto‑generated from changes).</w:t>
+              <w:t>Issue #32 closed (</w:t>
+            </w:r>
+            <w:proofErr w:type="gramStart"/>
+            <w:r>
+              <w:t>logs auto‑generated</w:t>
+            </w:r>
+            <w:proofErr w:type="gramEnd"/>
+            <w:r>
+              <w:t xml:space="preserve"> from changes).</w:t>
             </w:r>
           </w:p>
         </w:tc>
@@ -702,7 +739,6 @@
           </w:tcPr>
           <w:p>
             <w:r>
-              <w:lastRenderedPageBreak/>
               <w:t>US-15</w:t>
             </w:r>
           </w:p>
@@ -775,7 +811,15 @@
           </w:tcPr>
           <w:p>
             <w:r>
-              <w:t>Issue #35 open (#5, #78).</w:t>
+              <w:t xml:space="preserve">Issue #35 </w:t>
+            </w:r>
+            <w:proofErr w:type="gramStart"/>
+            <w:r>
+              <w:t>open (#5, #</w:t>
+            </w:r>
+            <w:proofErr w:type="gramEnd"/>
+            <w:r>
+              <w:t>78).</w:t>
             </w:r>
           </w:p>
         </w:tc>
@@ -839,8 +883,8 @@
           <w:noProof/>
         </w:rPr>
         <w:drawing>
-          <wp:inline distT="0" distB="0" distL="0" distR="0" wp14:anchorId="5950194F" wp14:editId="17F1AE33">
-            <wp:extent cx="6086235" cy="2514798"/>
+          <wp:inline distT="0" distB="0" distL="0" distR="0" wp14:anchorId="5950194F" wp14:editId="36EA8D8A">
+            <wp:extent cx="9144000" cy="3778250"/>
             <wp:effectExtent l="0" t="0" r="0" b="0"/>
             <wp:docPr id="32449981" name="Picture 1"/>
             <wp:cNvGraphicFramePr>
@@ -862,7 +906,7 @@
                   <pic:spPr>
                     <a:xfrm>
                       <a:off x="0" y="0"/>
-                      <a:ext cx="6142041" cy="2537857"/>
+                      <a:ext cx="9241978" cy="3818734"/>
                     </a:xfrm>
                     <a:prstGeom prst="rect">
                       <a:avLst/>
@@ -877,7 +921,15 @@
     </w:p>
     <w:p>
       <w:r>
-        <w:t>Layered architecture: Controllers → Services → Data → Models. Planned components (external sync) are marked in yellow, implemented components are green.</w:t>
+        <w:t xml:space="preserve">Layered architecture: Controllers → Services → Data → Models. Planned components (external sync) are </w:t>
+      </w:r>
+      <w:proofErr w:type="gramStart"/>
+      <w:r>
+        <w:t>marked in</w:t>
+      </w:r>
+      <w:proofErr w:type="gramEnd"/>
+      <w:r>
+        <w:t xml:space="preserve"> yellow, implemented components are green.</w:t>
       </w:r>
     </w:p>
     <w:p>
@@ -887,6 +939,7 @@
     </w:p>
     <w:p>
       <w:r>
+        <w:lastRenderedPageBreak/>
         <w:t>Layer definitions:</w:t>
       </w:r>
     </w:p>
@@ -919,7 +972,15 @@
         <w:pStyle w:val="ListBullet"/>
       </w:pPr>
       <w:r>
-        <w:t>Data layer: EF Core DbContext, migrations, and import utilities, uses LINQ (C# query syntax) instead of raw SQL.</w:t>
+        <w:t xml:space="preserve">Data layer: EF Core </w:t>
+      </w:r>
+      <w:proofErr w:type="spellStart"/>
+      <w:r>
+        <w:t>DbContext</w:t>
+      </w:r>
+      <w:proofErr w:type="spellEnd"/>
+      <w:r>
+        <w:t>, migrations, and import utilities, uses LINQ (C# query syntax) instead of raw SQL.</w:t>
       </w:r>
     </w:p>
     <w:p>
@@ -927,7 +988,15 @@
         <w:pStyle w:val="ListBullet"/>
       </w:pPr>
       <w:r>
-        <w:t>Models: domain entities (Building, Street, User, Log) plus metadata like FieldSpecAttribute.</w:t>
+        <w:t xml:space="preserve">Models: domain entities (Building, Street, User, Log) plus metadata like </w:t>
+      </w:r>
+      <w:proofErr w:type="spellStart"/>
+      <w:r>
+        <w:t>FieldSpecAttribute</w:t>
+      </w:r>
+      <w:proofErr w:type="spellEnd"/>
+      <w:r>
+        <w:t>.</w:t>
       </w:r>
     </w:p>
     <w:p>
@@ -955,7 +1024,15 @@
         <w:pStyle w:val="ListBullet"/>
       </w:pPr>
       <w:r>
-        <w:t>Clear separation of backend/frontend (`project/web-server`).</w:t>
+        <w:t>Clear separation of backend/frontend (`project/</w:t>
+      </w:r>
+      <w:proofErr w:type="gramStart"/>
+      <w:r>
+        <w:t>web-server</w:t>
+      </w:r>
+      <w:proofErr w:type="gramEnd"/>
+      <w:r>
+        <w:t>`).</w:t>
       </w:r>
     </w:p>
     <w:p>
@@ -1034,12 +1111,28 @@
         <w:pStyle w:val="ListBullet"/>
       </w:pPr>
       <w:r>
-        <w:t>Temporary client testing host: team PC kept online with No‑IP + port‑forwarding (external HTTPS 443 → frontend 443, backend internal 8080, PostgreSQL 5432, pgAdmin HTTPS 8443). Client access: https://ghosthouses.myddns.me/.</w:t>
+        <w:t xml:space="preserve">Temporary client testing host: team PC kept online with No‑IP + port‑forwarding (external HTTPS 443 → frontend 443, backend internal 8080, PostgreSQL 5432, </w:t>
+      </w:r>
+      <w:proofErr w:type="spellStart"/>
+      <w:r>
+        <w:t>pgAdmin</w:t>
+      </w:r>
+      <w:proofErr w:type="spellEnd"/>
+      <w:r>
+        <w:t xml:space="preserve"> HTTPS 8443). Client access: https://ghosthouses.myddns.me/.</w:t>
       </w:r>
     </w:p>
     <w:p>
       <w:r>
-        <w:t>Current port layout: Frontend HTTPS 443 (public), backend internal 8080 (not exposed), PostgreSQL 5432 (internal), pgAdmin HTTPS 8443 (admin‑only).</w:t>
+        <w:t xml:space="preserve">Current port layout: Frontend HTTPS 443 (public), backend internal 8080 (not exposed), PostgreSQL 5432 (internal), </w:t>
+      </w:r>
+      <w:proofErr w:type="spellStart"/>
+      <w:r>
+        <w:t>pgAdmin</w:t>
+      </w:r>
+      <w:proofErr w:type="spellEnd"/>
+      <w:r>
+        <w:t xml:space="preserve"> HTTPS 8443 (admin‑only).</w:t>
       </w:r>
     </w:p>
     <w:p>
@@ -1047,7 +1140,39 @@
         <w:pStyle w:val="ListBullet"/>
       </w:pPr>
       <w:r>
-        <w:t>Network isolation: app-net (frontend↔backend), db-net (backend↔db), admin-net (pgAdmin↔db).</w:t>
+        <w:t>Network isolation: app-net (</w:t>
+      </w:r>
+      <w:proofErr w:type="spellStart"/>
+      <w:r>
+        <w:t>frontend↔backend</w:t>
+      </w:r>
+      <w:proofErr w:type="spellEnd"/>
+      <w:r>
+        <w:t xml:space="preserve">), </w:t>
+      </w:r>
+      <w:proofErr w:type="spellStart"/>
+      <w:r>
+        <w:t>db</w:t>
+      </w:r>
+      <w:proofErr w:type="spellEnd"/>
+      <w:r>
+        <w:t>-net (</w:t>
+      </w:r>
+      <w:proofErr w:type="spellStart"/>
+      <w:r>
+        <w:t>backend↔db</w:t>
+      </w:r>
+      <w:proofErr w:type="spellEnd"/>
+      <w:r>
+        <w:t>), admin-net (</w:t>
+      </w:r>
+      <w:proofErr w:type="spellStart"/>
+      <w:r>
+        <w:t>pgAdmin↔db</w:t>
+      </w:r>
+      <w:proofErr w:type="spellEnd"/>
+      <w:r>
+        <w:t>).</w:t>
       </w:r>
     </w:p>
     <w:p>
@@ -1089,7 +1214,15 @@
         <w:pStyle w:val="ListBullet"/>
       </w:pPr>
       <w:r>
-        <w:t>Same as HLD: GitHub workflow (dev for ongoing work, main for stable releases) and a Dockerized stack.</w:t>
+        <w:t xml:space="preserve">Same as HLD: GitHub workflow (dev for ongoing work, main for stable releases) and a </w:t>
+      </w:r>
+      <w:proofErr w:type="spellStart"/>
+      <w:r>
+        <w:t>Dockerized</w:t>
+      </w:r>
+      <w:proofErr w:type="spellEnd"/>
+      <w:r>
+        <w:t xml:space="preserve"> stack.</w:t>
       </w:r>
     </w:p>
     <w:p>
@@ -1097,7 +1230,15 @@
         <w:pStyle w:val="ListBullet"/>
       </w:pPr>
       <w:r>
-        <w:t>Changed: official Windows Server deployment is delayed, a temporary host is used to keep client testing active.</w:t>
+        <w:t xml:space="preserve">Changed: official Windows Server deployment is </w:t>
+      </w:r>
+      <w:proofErr w:type="gramStart"/>
+      <w:r>
+        <w:t>delayed,</w:t>
+      </w:r>
+      <w:proofErr w:type="gramEnd"/>
+      <w:r>
+        <w:t xml:space="preserve"> a temporary host is used to keep client testing active.</w:t>
       </w:r>
     </w:p>
     <w:p>
@@ -1225,11 +1366,11 @@
         <w:tblLook w:val="04A0" w:firstRow="1" w:lastRow="0" w:firstColumn="1" w:lastColumn="0" w:noHBand="0" w:noVBand="1"/>
       </w:tblPr>
       <w:tblGrid>
-        <w:gridCol w:w="1608"/>
-        <w:gridCol w:w="1645"/>
+        <w:gridCol w:w="1728"/>
+        <w:gridCol w:w="1728"/>
         <w:gridCol w:w="1758"/>
-        <w:gridCol w:w="1640"/>
-        <w:gridCol w:w="1645"/>
+        <w:gridCol w:w="1728"/>
+        <w:gridCol w:w="1728"/>
       </w:tblGrid>
       <w:tr>
         <w:tc>
@@ -1570,7 +1711,15 @@
       </w:r>
       <w:r>
         <w:br/>
-        <w:t>Backlog should be reviewed in the GitHub Project board (visual view).</w:t>
+        <w:t xml:space="preserve">Backlog should be reviewed </w:t>
+      </w:r>
+      <w:proofErr w:type="gramStart"/>
+      <w:r>
+        <w:t>in</w:t>
+      </w:r>
+      <w:proofErr w:type="gramEnd"/>
+      <w:r>
+        <w:t xml:space="preserve"> the GitHub Project board (visual view).</w:t>
       </w:r>
     </w:p>
     <w:p>
@@ -1599,7 +1748,15 @@
         <w:pStyle w:val="ListBullet"/>
       </w:pPr>
       <w:r>
-        <w:t>#78 Deployment on client Windows Server</w:t>
+        <w:t xml:space="preserve">#78 Deployment </w:t>
+      </w:r>
+      <w:proofErr w:type="gramStart"/>
+      <w:r>
+        <w:t>on</w:t>
+      </w:r>
+      <w:proofErr w:type="gramEnd"/>
+      <w:r>
+        <w:t xml:space="preserve"> client Windows Server</w:t>
       </w:r>
     </w:p>
     <w:p>
@@ -1673,9 +1830,9 @@
           <w:noProof/>
         </w:rPr>
         <w:drawing>
-          <wp:inline distT="0" distB="0" distL="0" distR="0" wp14:anchorId="1AF29167" wp14:editId="33BAFD0C">
-            <wp:extent cx="6108636" cy="8101013"/>
-            <wp:effectExtent l="0" t="0" r="6985" b="0"/>
+          <wp:inline distT="0" distB="0" distL="0" distR="0" wp14:anchorId="1AF29167" wp14:editId="54778C74">
+            <wp:extent cx="3545234" cy="4701540"/>
+            <wp:effectExtent l="0" t="0" r="0" b="3810"/>
             <wp:docPr id="1004512952" name="Picture 2"/>
             <wp:cNvGraphicFramePr>
               <a:graphicFrameLocks xmlns:a="http://schemas.openxmlformats.org/drawingml/2006/main" noChangeAspect="1"/>
@@ -1696,7 +1853,7 @@
                   <pic:spPr>
                     <a:xfrm>
                       <a:off x="0" y="0"/>
-                      <a:ext cx="6176881" cy="8191517"/>
+                      <a:ext cx="3614243" cy="4793056"/>
                     </a:xfrm>
                     <a:prstGeom prst="rect">
                       <a:avLst/>
@@ -1730,9 +1887,9 @@
           <w:noProof/>
         </w:rPr>
         <w:drawing>
-          <wp:inline distT="0" distB="0" distL="0" distR="0" wp14:anchorId="05B9DF92" wp14:editId="24186004">
-            <wp:extent cx="6104407" cy="2522306"/>
-            <wp:effectExtent l="0" t="0" r="0" b="0"/>
+          <wp:inline distT="0" distB="0" distL="0" distR="0" wp14:anchorId="05B9DF92" wp14:editId="505B0DD3">
+            <wp:extent cx="9276168" cy="3832860"/>
+            <wp:effectExtent l="0" t="0" r="1270" b="0"/>
             <wp:docPr id="393530760" name="Picture 3"/>
             <wp:cNvGraphicFramePr>
               <a:graphicFrameLocks xmlns:a="http://schemas.openxmlformats.org/drawingml/2006/main" noChangeAspect="1"/>
@@ -1753,7 +1910,7 @@
                   <pic:spPr>
                     <a:xfrm>
                       <a:off x="0" y="0"/>
-                      <a:ext cx="6147952" cy="2540299"/>
+                      <a:ext cx="9351018" cy="3863787"/>
                     </a:xfrm>
                     <a:prstGeom prst="rect">
                       <a:avLst/>
@@ -1767,8 +1924,13 @@
       </w:r>
     </w:p>
     <w:p>
+      <w:proofErr w:type="gramStart"/>
       <w:r>
-        <w:t>Implementation‑accurate class diagram, planned components are marked separately.</w:t>
+        <w:t>Implementation‑accurate class diagram,</w:t>
+      </w:r>
+      <w:proofErr w:type="gramEnd"/>
+      <w:r>
+        <w:t xml:space="preserve"> planned components are marked separately.</w:t>
       </w:r>
     </w:p>
     <w:p>
@@ -1792,9 +1954,9 @@
           <w:noProof/>
         </w:rPr>
         <w:drawing>
-          <wp:inline distT="0" distB="0" distL="0" distR="0" wp14:anchorId="0984281D" wp14:editId="794E8F58">
-            <wp:extent cx="6109652" cy="1951694"/>
-            <wp:effectExtent l="0" t="0" r="5715" b="0"/>
+          <wp:inline distT="0" distB="0" distL="0" distR="0" wp14:anchorId="0984281D" wp14:editId="1799777C">
+            <wp:extent cx="9231468" cy="2948940"/>
+            <wp:effectExtent l="0" t="0" r="8255" b="3810"/>
             <wp:docPr id="1877252500" name="Picture 4"/>
             <wp:cNvGraphicFramePr>
               <a:graphicFrameLocks xmlns:a="http://schemas.openxmlformats.org/drawingml/2006/main" noChangeAspect="1"/>
@@ -1815,7 +1977,7 @@
                   <pic:spPr>
                     <a:xfrm>
                       <a:off x="0" y="0"/>
-                      <a:ext cx="6153492" cy="1965698"/>
+                      <a:ext cx="9304824" cy="2972373"/>
                     </a:xfrm>
                     <a:prstGeom prst="rect">
                       <a:avLst/>
@@ -1835,12 +1997,25 @@
     </w:p>
     <w:p>
       <w:r>
-        <w:t>Docker containers: frontend + backend run in containers on the web server, PostgreSQL + pgAdmin run in containers on the database server.</w:t>
+        <w:t xml:space="preserve">Docker containers: frontend + backend run in containers on the web server, PostgreSQL + </w:t>
+      </w:r>
+      <w:proofErr w:type="spellStart"/>
+      <w:r>
+        <w:t>pgAdmin</w:t>
+      </w:r>
+      <w:proofErr w:type="spellEnd"/>
+      <w:r>
+        <w:t xml:space="preserve"> run in containers on the database server.</w:t>
       </w:r>
     </w:p>
     <w:p>
+      <w:proofErr w:type="spellStart"/>
       <w:r>
-        <w:t>pgAdmin is for municipality IT/DB admins only (not end users).</w:t>
+        <w:t>pgAdmin</w:t>
+      </w:r>
+      <w:proofErr w:type="spellEnd"/>
+      <w:r>
+        <w:t xml:space="preserve"> is for municipality IT/DB admins only (not end users).</w:t>
       </w:r>
     </w:p>
     <w:p>
@@ -1859,9 +2034,9 @@
           <w:noProof/>
         </w:rPr>
         <w:drawing>
-          <wp:inline distT="0" distB="0" distL="0" distR="0" wp14:anchorId="61B2C930" wp14:editId="11C2213B">
-            <wp:extent cx="6165532" cy="1347996"/>
-            <wp:effectExtent l="0" t="0" r="6985" b="5080"/>
+          <wp:inline distT="0" distB="0" distL="0" distR="0" wp14:anchorId="61B2C930" wp14:editId="77FCFD8A">
+            <wp:extent cx="9235977" cy="2019300"/>
+            <wp:effectExtent l="0" t="0" r="3810" b="0"/>
             <wp:docPr id="819958445" name="Picture 5"/>
             <wp:cNvGraphicFramePr>
               <a:graphicFrameLocks xmlns:a="http://schemas.openxmlformats.org/drawingml/2006/main" noChangeAspect="1"/>
@@ -1882,7 +2057,7 @@
                   <pic:spPr>
                     <a:xfrm>
                       <a:off x="0" y="0"/>
-                      <a:ext cx="6237795" cy="1363795"/>
+                      <a:ext cx="9353614" cy="2045019"/>
                     </a:xfrm>
                     <a:prstGeom prst="rect">
                       <a:avLst/>
@@ -1897,12 +2072,36 @@
     </w:p>
     <w:p>
       <w:r>
-        <w:t>Current temporary hosting on team PC with No‑IP DNS (https://ghosthouses.myddns.me) and port‑forwarding (external HTTPS 443 → frontend 443, backend API internal 8080, PostgreSQL 5432, pgAdmin HTTPS 8443). Network split mirrors the desired setup: app‑net (frontend ↔ backend), db‑net (backend ↔ DB), admin‑net (pgAdmin ↔ DB).</w:t>
+        <w:t xml:space="preserve">Current temporary hosting on team PC with No‑IP DNS (https://ghosthouses.myddns.me) and port‑forwarding (external HTTPS 443 → frontend 443, backend API internal 8080, PostgreSQL 5432, </w:t>
+      </w:r>
+      <w:proofErr w:type="spellStart"/>
+      <w:r>
+        <w:t>pgAdmin</w:t>
+      </w:r>
+      <w:proofErr w:type="spellEnd"/>
+      <w:r>
+        <w:t xml:space="preserve"> HTTPS 8443). Network split mirrors the desired setup: app‑net (frontend ↔ backend), </w:t>
+      </w:r>
+      <w:proofErr w:type="spellStart"/>
+      <w:r>
+        <w:t>db</w:t>
+      </w:r>
+      <w:proofErr w:type="spellEnd"/>
+      <w:r>
+        <w:t>‑net (backend ↔ DB), admin‑net (</w:t>
+      </w:r>
+      <w:proofErr w:type="spellStart"/>
+      <w:r>
+        <w:t>pgAdmin</w:t>
+      </w:r>
+      <w:proofErr w:type="spellEnd"/>
+      <w:r>
+        <w:t xml:space="preserve"> ↔ DB).</w:t>
       </w:r>
     </w:p>
     <w:sectPr>
-      <w:pgSz w:w="11906" w:h="16838" w:code="9"/>
-      <w:pgMar w:top="1440" w:right="1800" w:bottom="1440" w:left="1800" w:header="720" w:footer="720" w:gutter="0"/>
+      <w:pgSz w:w="16838" w:h="11906" w:orient="landscape" w:code="9"/>
+      <w:pgMar w:top="1800" w:right="1440" w:bottom="1800" w:left="1440" w:header="720" w:footer="720" w:gutter="0"/>
       <w:cols w:space="720"/>
       <w:docGrid w:linePitch="360"/>
     </w:sectPr>

</xml_diff>